<commit_message>
feat: Enhance telemetry and connection monitoring
- Updated AutonomyPanel to accept vehicle data as a prop for improved state management.
- Modified useVehicle to calculate live telemetry intervals and maintain a history of vehicle states.
- Increased snapshot frequency from 2 Hz to 10 Hz for better real-time data representation in ROS 2.
- Added ConnectionStatus and OrientationMonitor components for detailed connection and orientation metrics.
- Implemented a latency check script to measure receive-to-monitor latency for telemetry data.
- Documented improvements in monitoring latency and telemetry updates in the project plan.
</commit_message>
<xml_diff>
--- a/doc/11-topologi-keseluruhan-sistem.docx
+++ b/doc/11-topologi-keseluruhan-sistem.docx
@@ -2938,7 +2938,7 @@
                 <w:i w:val="0"/>
                 <w:sz w:val="17"/>
               </w:rPr>
-              <w:t>WebSocket JSON, snapshot kendaraan/host/events sekitar 2 Hz</w:t>
+              <w:t>WebSocket JSON, snapshot kendaraan/host/events sekitar 10 Hz</w:t>
             </w:r>
           </w:p>
         </w:tc>
@@ -3021,7 +3021,24 @@
                 <w:i w:val="0"/>
                 <w:sz w:val="17"/>
               </w:rPr>
-              <w:t>Runtime, rencana, kendaraan, graph, dan riwayat</w:t>
+              <w:t xml:space="preserve">Runtime, rencana, graph, dan riwayat; telemetri kendaraan pada tampilan memakai </w:t>
+            </w:r>
+            <w:r>
+              <w:rPr>
+                <w:rFonts w:ascii="Consolas" w:hAnsi="Consolas"/>
+                <w:b w:val="0"/>
+                <w:i w:val="0"/>
+                <w:sz w:val="17"/>
+              </w:rPr>
+              <w:t>/api/live</w:t>
+            </w:r>
+            <w:r>
+              <w:rPr>
+                <w:b w:val="0"/>
+                <w:i w:val="0"/>
+                <w:sz w:val="17"/>
+              </w:rPr>
+              <w:t xml:space="preserve"> 10 Hz</w:t>
             </w:r>
           </w:p>
         </w:tc>
@@ -3646,7 +3663,7 @@
         <w:t>/auv2027/vehicle/state</w:t>
       </w:r>
       <w:r>
-        <w:t xml:space="preserve"> sekitar 2 Hz.</w:t>
+        <w:t xml:space="preserve"> sekitar 10 Hz.</w:t>
       </w:r>
     </w:p>
     <w:p>

</xml_diff>